<commit_message>
feat: procurações AD JUDICIA padronizadas para todos os 39 advogados
- Novo formato: PROCURAÇÃO AD JUDICIA com seções separadas
  OUTORGANTE / OUTORGADO / PODERES CONFERIDOS (art. 105 CPC)
- Gênero corrigido: Dr./Dra., inscrito/inscrita, advogado/advogada,
  CONTRATADO/CONTRATADA, OUTORGADO/OUTORGADA
- <<assinatura_cliente>> branco + centralizado em contratos e procurações
- Novos advogados SP: lucasvicente (503.042), rafael (484.749),
  miguel (549.289), frederico (116.907)
- Contratos SP: foro Santos/SP, OAB Seção de São Paulo
- _padrao atualizado com tokens __DR_DRA__, __ADVOGADO_NOME__ etc.

Co-Authored-By: Claude Sonnet 4.6 <noreply@anthropic.com>
</commit_message>
<xml_diff>
--- a/backend/modelos/ana/modelo_contrato_ana.docx
+++ b/backend/modelos/ana/modelo_contrato_ana.docx
@@ -46,37 +46,29 @@
         <w:rPr>
           <w:lang w:val="pt-PT"/>
         </w:rPr>
-        <w:t>De um lado {{nome}}, {{nacionalidade}}, inscrito(a) no {{tipo_documento}} sob o n</w:t>
-      </w:r>
-      <w:r>
-        <w:t xml:space="preserve">º </w:t>
-      </w:r>
-      <w:r>
-        <w:rPr>
-          <w:lang w:val="pt-PT"/>
-        </w:rPr>
-        <w:t xml:space="preserve">{{cpf}}, residente e domiciliado(a) </w:t>
-      </w:r>
-      <w:r>
-        <w:t xml:space="preserve">à </w:t>
-      </w:r>
-      <w:r>
-        <w:rPr>
-          <w:lang w:val="pt-PT"/>
-        </w:rPr>
-        <w:t xml:space="preserve">{{endereco_cliente}}, neste ato denominado(a) simplesmente como CONTRATANTE; e, de outro lado, </w:t>
-      </w:r>
-      <w:r>
-        <w:rPr>
-          <w:lang w:val="pt-PT"/>
-        </w:rPr>
-        <w:t>ANA KELLY DE CARVALHO MELO inscrita na OAB/MG sob o n.º 141.060</w:t>
-      </w:r>
-      <w:r>
-        <w:rPr>
-          <w:lang w:val="pt-PT"/>
-        </w:rPr>
-        <w:t>, neste ato denominado simplesmente como CONTRATADO.</w:t>
+        <w:t>De um lado {{nome}}, {{nacionalidade}}, inscrito(a) no {{tipo_documento}} sob o nº {{cpf}}, residente e domiciliado(a) à {{endereco_cliente}}, neste ato denominado(a) simplesmente como CONTRATANTE; e, de outro lado, ANA KELLY DE CARVALHO MELO inscrita na OAB/MG sob o n.º 141.060, neste ato denominada simplesmente como CONTRATADA.</w:t>
+      </w:r>
+      <w:r/>
+      <w:r>
+        <w:rPr>
+          <w:lang w:val="pt-PT"/>
+        </w:rPr>
+      </w:r>
+      <w:r/>
+      <w:r>
+        <w:rPr>
+          <w:lang w:val="pt-PT"/>
+        </w:rPr>
+      </w:r>
+      <w:r>
+        <w:rPr>
+          <w:lang w:val="pt-PT"/>
+        </w:rPr>
+      </w:r>
+      <w:r>
+        <w:rPr>
+          <w:lang w:val="pt-PT"/>
+        </w:rPr>
       </w:r>
     </w:p>
     <w:p>
@@ -302,7 +294,7 @@
         <w:jc w:val="both"/>
       </w:pPr>
       <w:r>
-        <w:t>Parágrafo 2º – Considerar-se-ão vencidos e imediatamente exigíveis os honorários pactuados caso: (i) o cliente seja vencedor na ação; (ii) seja celebrado acordo com a parte contrária sem o concurso do CONTRATADO; (iii) seja cassada a procuração; ou (iv) a ação não prossiga por motivos pessoais do CONTRATANTE ou alheios à vontade do CONTRATADO, incluindo desistência da ação ou conciliação.</w:t>
+        <w:t>Parágrafo 2º – Considerar-se-ão vencidos e imediatamente exigíveis os honorários pactuados caso: (i) o cliente seja vencedor na ação; (ii) seja celebrado acordo com a parte contrária sem o concurso da CONTRATADA; (iii) seja cassada a procuração; ou (iv) a ação não prossiga por motivos pessoais do CONTRATANTE ou alheios à vontade da CONTRATADA, incluindo desistência da ação ou conciliação.</w:t>
       </w:r>
     </w:p>
     <w:p>
@@ -374,34 +366,25 @@
         <w:rPr>
           <w:lang w:val="pt-PT"/>
         </w:rPr>
-        <w:t>Qualquer composição de natureza extrajudicial dever</w:t>
-      </w:r>
-      <w:r>
-        <w:t xml:space="preserve">á </w:t>
-      </w:r>
-      <w:r>
-        <w:rPr>
-          <w:lang w:val="pt-PT"/>
-        </w:rPr>
-        <w:t>ocorrer com a participação do CONTRATADO, ficando vedada ao CONTRATANTE a celebração de acordos diretamente. Em caso de descumprimento, aplica-se o disposto no Par</w:t>
-      </w:r>
-      <w:r>
-        <w:t xml:space="preserve">ágrafo 1º </w:t>
-      </w:r>
-      <w:r>
-        <w:rPr>
-          <w:lang w:val="pt-PT"/>
-        </w:rPr>
-        <w:t>da Cl</w:t>
-      </w:r>
-      <w:r>
-        <w:t>á</w:t>
-      </w:r>
-      <w:r>
-        <w:rPr>
-          <w:lang w:val="pt-PT"/>
-        </w:rPr>
-        <w:t>usula Terceira.</w:t>
+        <w:t>Qualquer composição de natureza extrajudicial deverá ocorrer com a participação da CONTRATADA, ficando vedada ao CONTRATANTE a celebração de acordos diretamente. Em caso de descumprimento, aplica-se o disposto no Parágrafo 1º da Cláusula Terceira.</w:t>
+      </w:r>
+      <w:r/>
+      <w:r>
+        <w:rPr>
+          <w:lang w:val="pt-PT"/>
+        </w:rPr>
+      </w:r>
+      <w:r/>
+      <w:r>
+        <w:rPr>
+          <w:lang w:val="pt-PT"/>
+        </w:rPr>
+      </w:r>
+      <w:r/>
+      <w:r>
+        <w:rPr>
+          <w:lang w:val="pt-PT"/>
+        </w:rPr>
       </w:r>
     </w:p>
     <w:p>
@@ -783,64 +766,50 @@
         <w:rPr>
           <w:lang w:val="pt-PT"/>
         </w:rPr>
-        <w:t>Considerar-se-ão vencidos e imediatamente exig</w:t>
-      </w:r>
-      <w:r>
-        <w:t>í</w:t>
-      </w:r>
-      <w:r>
-        <w:rPr>
-          <w:lang w:val="pt-PT"/>
-        </w:rPr>
-        <w:t>veis os honor</w:t>
-      </w:r>
-      <w:r>
-        <w:t>á</w:t>
-      </w:r>
-      <w:r>
-        <w:rPr>
-          <w:lang w:val="pt-PT"/>
-        </w:rPr>
-        <w:t>rios pactuados caso: (i) o cliente seja vencedor da ação; (ii) seja efetuado acordo com a parte contr</w:t>
-      </w:r>
-      <w:r>
-        <w:t>á</w:t>
-      </w:r>
-      <w:r>
-        <w:rPr>
-          <w:lang w:val="pt-PT"/>
-        </w:rPr>
-        <w:t>ria com ou sem o concurso do CONTRATADO; (iii) o CONTRATANTE ceda ou transfira o contrato de cons</w:t>
+        <w:t>Considerar-se-ão vencidos e imediatamente exigíveis os honorários pactuados caso: (i) o cliente seja vencedor da ação; (ii) seja efetuado acordo com a parte contrária com ou sem o concurso da CONTRATADA; (iii) o CONTRATANTE ceda ou transfira o contrato de consórcio objeto da ação; (iv) ocorra a contemplação via sorteio do consórcio objeto da ação.</w:t>
+      </w:r>
+      <w:r/>
+      <w:r>
+        <w:rPr>
+          <w:lang w:val="pt-PT"/>
+        </w:rPr>
+      </w:r>
+      <w:r/>
+      <w:r>
+        <w:rPr>
+          <w:lang w:val="pt-PT"/>
+        </w:rPr>
+      </w:r>
+      <w:r/>
+      <w:r>
+        <w:rPr>
+          <w:lang w:val="pt-PT"/>
+        </w:rPr>
       </w:r>
       <w:r>
         <w:rPr>
           <w:lang w:val="es-ES_tradnl"/>
         </w:rPr>
-        <w:t>ó</w:t>
-      </w:r>
-      <w:r>
-        <w:rPr>
-          <w:lang w:val="pt-PT"/>
-        </w:rPr>
-        <w:t>rcio objeto da ação; (iv) ocorra a contemplação via sorteio do cons</w:t>
+      </w:r>
+      <w:r>
+        <w:rPr>
+          <w:lang w:val="pt-PT"/>
+        </w:rPr>
       </w:r>
       <w:r>
         <w:rPr>
           <w:lang w:val="es-ES_tradnl"/>
         </w:rPr>
-        <w:t>ó</w:t>
-      </w:r>
-      <w:r>
-        <w:rPr>
-          <w:lang w:val="pt-PT"/>
-        </w:rPr>
-        <w:t>rcio objeto da açã</w:t>
+      </w:r>
+      <w:r>
+        <w:rPr>
+          <w:lang w:val="pt-PT"/>
+        </w:rPr>
       </w:r>
       <w:r>
         <w:rPr>
           <w:lang w:val="it-IT"/>
         </w:rPr>
-        <w:t>o.</w:t>
       </w:r>
     </w:p>
     <w:p>
@@ -897,6 +866,7 @@
           <w:tab w:val="left" w:pos="7920"/>
         </w:tabs>
         <w:spacing w:before="0" w:line="240" w:lineRule="auto"/>
+        <w:jc w:val="center"/>
         <w:rPr>
           <w:rFonts w:ascii="Arial Nova Cond" w:eastAsia="Arial Nova Cond" w:hAnsi="Arial Nova Cond" w:cs="Arial Nova Cond"/>
           <w:color w:val="000000" w:themeColor="text1"/>
@@ -907,120 +877,42 @@
       <w:r>
         <w:rPr>
           <w:rFonts w:ascii="Arial" w:hAnsi="Arial"/>
-          <w:color w:val="000000" w:themeColor="text1"/>
-          <w:lang w:val="pt-PT"/>
-        </w:rPr>
-        <w:tab/>
+          <w:color w:val="FFFFFF"/>
+          <w:lang w:val="pt-PT"/>
+        </w:rPr>
       </w:r>
       <w:r>
         <w:rPr>
           <w:rFonts w:ascii="Arial" w:hAnsi="Arial"/>
-          <w:color w:val="000000" w:themeColor="text1"/>
-          <w:lang w:val="pt-PT"/>
-        </w:rPr>
-        <w:tab/>
+          <w:color w:val="FFFFFF"/>
+          <w:lang w:val="pt-PT"/>
+        </w:rPr>
       </w:r>
       <w:r>
         <w:rPr>
           <w:rFonts w:ascii="Arial" w:hAnsi="Arial"/>
-          <w:color w:val="000000" w:themeColor="text1"/>
-          <w:lang w:val="pt-PT"/>
-        </w:rPr>
-        <w:tab/>
+          <w:color w:val="FFFFFF"/>
+          <w:lang w:val="pt-PT"/>
+        </w:rPr>
       </w:r>
       <w:r>
         <w:rPr>
           <w:rFonts w:ascii="Arial" w:hAnsi="Arial"/>
-          <w:color w:val="000000" w:themeColor="text1"/>
-          <w:lang w:val="pt-PT"/>
-        </w:rPr>
-        <w:tab/>
+          <w:color w:val="FFFFFF"/>
+          <w:lang w:val="pt-PT"/>
+        </w:rPr>
       </w:r>
       <w:r>
         <w:rPr>
           <w:rFonts w:ascii="Arial" w:hAnsi="Arial"/>
-          <w:color w:val="000000" w:themeColor="text1"/>
-          <w:lang w:val="pt-PT"/>
-        </w:rPr>
-        <w:tab/>
+          <w:color w:val="FFFFFF"/>
+          <w:lang w:val="pt-PT"/>
+        </w:rPr>
       </w:r>
       <w:r>
         <w:rPr>
           <w:rFonts w:ascii="Arial" w:hAnsi="Arial"/>
-          <w:color w:val="FFFFFF" w:themeColor="background1"/>
-          <w:lang w:val="pt-PT"/>
-        </w:rPr>
-        <w:t>&lt;&lt;assinatura_cliente&gt;&gt;</w:t>
-      </w:r>
-    </w:p>
-    <w:p>
-      <w:pPr>
-        <w:pStyle w:val="Padro"/>
-        <w:tabs>
-          <w:tab w:val="left" w:pos="720"/>
-          <w:tab w:val="left" w:pos="1440"/>
-          <w:tab w:val="left" w:pos="2160"/>
-          <w:tab w:val="left" w:pos="2880"/>
-          <w:tab w:val="left" w:pos="3600"/>
-          <w:tab w:val="left" w:pos="4320"/>
-          <w:tab w:val="left" w:pos="5040"/>
-          <w:tab w:val="left" w:pos="5760"/>
-          <w:tab w:val="left" w:pos="6480"/>
-          <w:tab w:val="left" w:pos="7200"/>
-          <w:tab w:val="left" w:pos="7920"/>
-        </w:tabs>
-        <w:spacing w:before="0" w:line="240" w:lineRule="auto"/>
-        <w:rPr>
-          <w:rFonts w:ascii="Arial Nova Cond" w:eastAsia="Arial Nova Cond" w:hAnsi="Arial Nova Cond" w:cs="Arial Nova Cond"/>
-          <w:color w:val="000000" w:themeColor="text1"/>
-          <w:sz w:val="26"/>
-          <w:szCs w:val="26"/>
-        </w:rPr>
-      </w:pPr>
-      <w:r>
-        <w:rPr>
-          <w:rFonts w:ascii="Arial" w:eastAsia="Arial" w:hAnsi="Arial" w:cs="Arial"/>
-          <w:color w:val="000000" w:themeColor="text1"/>
-          <w:lang w:val="pt-PT"/>
-        </w:rPr>
-        <w:tab/>
-      </w:r>
-      <w:r>
-        <w:rPr>
-          <w:rFonts w:ascii="Arial" w:eastAsia="Arial" w:hAnsi="Arial" w:cs="Arial"/>
-          <w:color w:val="000000" w:themeColor="text1"/>
-          <w:lang w:val="pt-PT"/>
-        </w:rPr>
-        <w:tab/>
-      </w:r>
-      <w:r>
-        <w:rPr>
-          <w:rFonts w:ascii="Arial" w:eastAsia="Arial" w:hAnsi="Arial" w:cs="Arial"/>
-          <w:color w:val="000000" w:themeColor="text1"/>
-          <w:lang w:val="pt-PT"/>
-        </w:rPr>
-        <w:tab/>
-      </w:r>
-      <w:r>
-        <w:rPr>
-          <w:rFonts w:ascii="Arial" w:eastAsia="Arial" w:hAnsi="Arial" w:cs="Arial"/>
-          <w:color w:val="000000" w:themeColor="text1"/>
-          <w:lang w:val="pt-PT"/>
-        </w:rPr>
-        <w:tab/>
-      </w:r>
-      <w:r>
-        <w:rPr>
-          <w:rFonts w:ascii="Arial" w:eastAsia="Arial" w:hAnsi="Arial" w:cs="Arial"/>
-          <w:color w:val="FFFFFF" w:themeColor="background1"/>
-          <w:lang w:val="pt-PT"/>
-        </w:rPr>
-        <w:tab/>
-      </w:r>
-      <w:r>
-        <w:rPr>
-          <w:rFonts w:ascii="Arial" w:hAnsi="Arial"/>
-          <w:color w:val="FFFFFF" w:themeColor="background1"/>
+          <w:color w:val="FFFFFF"/>
           <w:lang w:val="pt-PT"/>
         </w:rPr>
         <w:t>&lt;&lt;assinatura_cliente&gt;&gt;</w:t>

</xml_diff>